<commit_message>
chore(demo): regenerate DEMO outputs after quality-check run
Updated docx documents (load tables, summary, spec, cable journal, work list,
PNR) and DXF plans to reflect all code improvements from this session.

https://claude.ai/code/session_01EUXh9NoaZ7HpixNuaMKahR
</commit_message>
<xml_diff>
--- a/elec-system/projects/DEMO-2025-001_Офисный_центр/docs/load_summary.docx
+++ b/elec-system/projects/DEMO-2025-001_Офисный_центр/docs/load_summary.docx
@@ -274,6 +274,124 @@
                 <w:sz w:val="16"/>
               </w:rPr>
               <w:t>КРМ-0.4-15 (15 кВАр)</w:t>
+            </w:r>
+          </w:p>
+        </w:tc>
+      </w:tr>
+      <w:tr>
+        <w:tc>
+          <w:tcPr>
+            <w:tcW w:type="dxa" w:w="4320"/>
+          </w:tcPr>
+          <w:p>
+            <w:r>
+              <w:rPr>
+                <w:b w:val="0"/>
+                <w:sz w:val="16"/>
+              </w:rPr>
+            </w:r>
+          </w:p>
+        </w:tc>
+        <w:tc>
+          <w:tcPr>
+            <w:tcW w:type="dxa" w:w="4320"/>
+          </w:tcPr>
+          <w:p>
+            <w:r>
+              <w:rPr>
+                <w:b w:val="0"/>
+                <w:sz w:val="16"/>
+              </w:rPr>
+            </w:r>
+          </w:p>
+        </w:tc>
+      </w:tr>
+      <w:tr>
+        <w:tc>
+          <w:tcPr>
+            <w:tcW w:type="dxa" w:w="4320"/>
+          </w:tcPr>
+          <w:p>
+            <w:r>
+              <w:rPr>
+                <w:b w:val="0"/>
+                <w:sz w:val="16"/>
+              </w:rPr>
+              <w:t>Нарушения ΔU</w:t>
+            </w:r>
+          </w:p>
+        </w:tc>
+        <w:tc>
+          <w:tcPr>
+            <w:tcW w:type="dxa" w:w="4320"/>
+          </w:tcPr>
+          <w:p>
+            <w:r>
+              <w:rPr>
+                <w:b w:val="0"/>
+                <w:sz w:val="16"/>
+              </w:rPr>
+              <w:t>нет</w:t>
+            </w:r>
+          </w:p>
+        </w:tc>
+      </w:tr>
+      <w:tr>
+        <w:tc>
+          <w:tcPr>
+            <w:tcW w:type="dxa" w:w="4320"/>
+          </w:tcPr>
+          <w:p>
+            <w:r>
+              <w:rPr>
+                <w:b w:val="0"/>
+                <w:sz w:val="16"/>
+              </w:rPr>
+              <w:t>Нарушения термо-КЗ</w:t>
+            </w:r>
+          </w:p>
+        </w:tc>
+        <w:tc>
+          <w:tcPr>
+            <w:tcW w:type="dxa" w:w="4320"/>
+          </w:tcPr>
+          <w:p>
+            <w:r>
+              <w:rPr>
+                <w:b w:val="0"/>
+                <w:sz w:val="16"/>
+              </w:rPr>
+              <w:t>18 линий</w:t>
+            </w:r>
+          </w:p>
+        </w:tc>
+      </w:tr>
+      <w:tr>
+        <w:tc>
+          <w:tcPr>
+            <w:tcW w:type="dxa" w:w="4320"/>
+          </w:tcPr>
+          <w:p>
+            <w:r>
+              <w:rPr>
+                <w:b w:val="0"/>
+                <w:sz w:val="16"/>
+              </w:rPr>
+              <w:t>Нарушения чувствит. защиты</w:t>
+            </w:r>
+          </w:p>
+        </w:tc>
+        <w:tc>
+          <w:tcPr>
+            <w:tcW w:type="dxa" w:w="4320"/>
+          </w:tcPr>
+          <w:p>
+            <w:r>
+              <w:rPr>
+                <w:b w:val="0"/>
+                <w:sz w:val="16"/>
+              </w:rPr>
+              <w:t>нет</w:t>
             </w:r>
           </w:p>
         </w:tc>

</xml_diff>